<commit_message>
-Added instructions in "README_2.." to run the local instance of git-pages for dev -Resume V1 -file cleanup
</commit_message>
<xml_diff>
--- a/docs/antonia_iaquinta_resume.docx
+++ b/docs/antonia_iaquinta_resume.docx
@@ -1,6 +1,6 @@
 
 <file path=word/document.xml><?xml version="1.0" encoding="utf-8"?>
-<w:document xmlns:wpc="http://schemas.microsoft.com/office/word/2010/wordprocessingCanvas" xmlns:cx="http://schemas.microsoft.com/office/drawing/2014/chartex" xmlns:cx1="http://schemas.microsoft.com/office/drawing/2015/9/8/chartex" xmlns:cx2="http://schemas.microsoft.com/office/drawing/2015/10/21/chartex" xmlns:cx3="http://schemas.microsoft.com/office/drawing/2016/5/9/chartex" xmlns:cx4="http://schemas.microsoft.com/office/drawing/2016/5/10/chartex" xmlns:cx5="http://schemas.microsoft.com/office/drawing/2016/5/11/chartex" xmlns:cx6="http://schemas.microsoft.com/office/drawing/2016/5/12/chartex" xmlns:cx7="http://schemas.microsoft.com/office/drawing/2016/5/13/chartex" xmlns:cx8="http://schemas.microsoft.com/office/drawing/2016/5/14/chartex" xmlns:mc="http://schemas.openxmlformats.org/markup-compatibility/2006" xmlns:aink="http://schemas.microsoft.com/office/drawing/2016/ink" xmlns:am3d="http://schemas.microsoft.com/office/drawing/2017/model3d" xmlns:o="urn:schemas-microsoft-com:office:office" xmlns:oel="http://schemas.microsoft.com/office/2019/extlst" xmlns:r="http://schemas.openxmlformats.org/officeDocument/2006/relationships" xmlns:m="http://schemas.openxmlformats.org/officeDocument/2006/math" xmlns:v="urn:schemas-microsoft-com:vml" xmlns:wp14="http://schemas.microsoft.com/office/word/2010/wordprocessingDrawing" xmlns:wp="http://schemas.openxmlformats.org/drawingml/2006/wordprocessingDrawing" xmlns:w10="urn:schemas-microsoft-com:office:word" xmlns:w="http://schemas.openxmlformats.org/wordprocessingml/2006/main" xmlns:w14="http://schemas.microsoft.com/office/word/2010/wordml" xmlns:w15="http://schemas.microsoft.com/office/word/2012/wordml" xmlns:w16cex="http://schemas.microsoft.com/office/word/2018/wordml/cex" xmlns:w16cid="http://schemas.microsoft.com/office/word/2016/wordml/cid" xmlns:w16="http://schemas.microsoft.com/office/word/2018/wordml" xmlns:w16du="http://schemas.microsoft.com/office/word/2023/wordml/word16du" xmlns:w16sdtdh="http://schemas.microsoft.com/office/word/2020/wordml/sdtdatahash" xmlns:w16sdtfl="http://schemas.microsoft.com/office/word/2024/wordml/sdtformatlock" xmlns:w16se="http://schemas.microsoft.com/office/word/2015/wordml/symex" xmlns:wpg="http://schemas.microsoft.com/office/word/2010/wordprocessingGroup" xmlns:wpi="http://schemas.microsoft.com/office/word/2010/wordprocessingInk" xmlns:wne="http://schemas.microsoft.com/office/word/2006/wordml" xmlns:wps="http://schemas.microsoft.com/office/word/2010/wordprocessingShape" mc:Ignorable="w14 w15 w16se w16cid w16 w16cex w16sdtdh w16sdtfl w16du wp14">
+<w:document xmlns:wpc="http://schemas.microsoft.com/office/word/2010/wordprocessingCanvas" xmlns:cx="http://schemas.microsoft.com/office/drawing/2014/chartex" xmlns:cx1="http://schemas.microsoft.com/office/drawing/2015/9/8/chartex" xmlns:cx2="http://schemas.microsoft.com/office/drawing/2015/10/21/chartex" xmlns:cx3="http://schemas.microsoft.com/office/drawing/2016/5/9/chartex" xmlns:cx4="http://schemas.microsoft.com/office/drawing/2016/5/10/chartex" xmlns:cx5="http://schemas.microsoft.com/office/drawing/2016/5/11/chartex" xmlns:cx6="http://schemas.microsoft.com/office/drawing/2016/5/12/chartex" xmlns:cx7="http://schemas.microsoft.com/office/drawing/2016/5/13/chartex" xmlns:cx8="http://schemas.microsoft.com/office/drawing/2016/5/14/chartex" xmlns:mc="http://schemas.openxmlformats.org/markup-compatibility/2006" xmlns:aink="http://schemas.microsoft.com/office/drawing/2016/ink" xmlns:am3d="http://schemas.microsoft.com/office/drawing/2017/model3d" xmlns:o="urn:schemas-microsoft-com:office:office" xmlns:oel="http://schemas.microsoft.com/office/2019/extlst" xmlns:r="http://schemas.openxmlformats.org/officeDocument/2006/relationships" xmlns:m="http://schemas.openxmlformats.org/officeDocument/2006/math" xmlns:v="urn:schemas-microsoft-com:vml" xmlns:wp14="http://schemas.microsoft.com/office/word/2010/wordprocessingDrawing" xmlns:wp="http://schemas.openxmlformats.org/drawingml/2006/wordprocessingDrawing" xmlns:w10="urn:schemas-microsoft-com:office:word" xmlns:w="http://schemas.openxmlformats.org/wordprocessingml/2006/main" xmlns:w14="http://schemas.microsoft.com/office/word/2010/wordml" xmlns:w15="http://schemas.microsoft.com/office/word/2012/wordml" xmlns:w16cei="http://schemas.microsoft.com/office/word/2026/wordml/cei" xmlns:w16cex="http://schemas.microsoft.com/office/word/2018/wordml/cex" xmlns:w16cid="http://schemas.microsoft.com/office/word/2016/wordml/cid" xmlns:w16="http://schemas.microsoft.com/office/word/2018/wordml" xmlns:w16du="http://schemas.microsoft.com/office/word/2023/wordml/word16du" xmlns:w16sdtdh="http://schemas.microsoft.com/office/word/2020/wordml/sdtdatahash" xmlns:w16sdtfl="http://schemas.microsoft.com/office/word/2024/wordml/sdtformatlock" xmlns:w16se="http://schemas.microsoft.com/office/word/2015/wordml/symex" xmlns:wpg="http://schemas.microsoft.com/office/word/2010/wordprocessingGroup" xmlns:wpi="http://schemas.microsoft.com/office/word/2010/wordprocessingInk" xmlns:wne="http://schemas.microsoft.com/office/word/2006/wordml" xmlns:wps="http://schemas.microsoft.com/office/word/2010/wordprocessingShape" mc:Ignorable="w14 w15 w16se w16cid w16 w16cex w16sdtdh w16sdtfl w16du wp14">
   <w:body>
     <w:p>
       <w:pPr>
@@ -17,10 +17,7 @@
         <w:spacing w:after="0"/>
       </w:pPr>
       <w:r>
-        <w:t>Norwell</w:t>
-      </w:r>
-      <w:r>
-        <w:t xml:space="preserve">, MA | (978) 935-6559 | </w:t>
+        <w:t xml:space="preserve">Norwell, MA | (978) 935-6559 | </w:t>
       </w:r>
       <w:hyperlink r:id="rId5" w:history="1">
         <w:r>
@@ -36,9 +33,14 @@
         <w:pStyle w:val="BodyText"/>
         <w:spacing w:before="0" w:after="0"/>
       </w:pPr>
-      <w:r>
-        <w:t>https://github.com/golden_hail.github.io</w:t>
-      </w:r>
+      <w:hyperlink r:id="rId6" w:history="1">
+        <w:r>
+          <w:rPr>
+            <w:rStyle w:val="Hyperlink"/>
+          </w:rPr>
+          <w:t>https://github.com/golden_hail.github.io</w:t>
+        </w:r>
+      </w:hyperlink>
     </w:p>
     <w:p>
       <w:pPr>
@@ -132,26 +134,42 @@
         <w:t xml:space="preserve"> MATLAB, </w:t>
       </w:r>
       <w:r>
-        <w:t>python</w:t>
-      </w:r>
-      <w:r>
-        <w:t xml:space="preserve"> (pandas, </w:t>
+        <w:t>P</w:t>
+      </w:r>
+      <w:r>
+        <w:t>ython</w:t>
+      </w:r>
+      <w:r>
+        <w:t xml:space="preserve"> (</w:t>
+      </w:r>
+      <w:r>
+        <w:t>P</w:t>
+      </w:r>
+      <w:r>
+        <w:t xml:space="preserve">andas, </w:t>
       </w:r>
       <w:proofErr w:type="spellStart"/>
       <w:r>
-        <w:t>numpy</w:t>
+        <w:t>N</w:t>
+      </w:r>
+      <w:r>
+        <w:t>umpy</w:t>
       </w:r>
       <w:proofErr w:type="spellEnd"/>
       <w:r>
-        <w:t xml:space="preserve">, matplotlib, </w:t>
-      </w:r>
-      <w:proofErr w:type="spellStart"/>
-      <w:r>
-        <w:t>sklearn</w:t>
-      </w:r>
-      <w:proofErr w:type="spellEnd"/>
-      <w:r>
-        <w:t>)</w:t>
+        <w:t xml:space="preserve">, </w:t>
+      </w:r>
+      <w:r>
+        <w:t>M</w:t>
+      </w:r>
+      <w:r>
+        <w:t xml:space="preserve">atplotlib, </w:t>
+      </w:r>
+      <w:r>
+        <w:t>Scikit-L</w:t>
+      </w:r>
+      <w:r>
+        <w:t>earn)</w:t>
       </w:r>
       <w:r>
         <w:t xml:space="preserve">, </w:t>
@@ -170,7 +188,37 @@
         <w:t>Systems &amp; Dev Tools:</w:t>
       </w:r>
       <w:r>
-        <w:t xml:space="preserve"> IBM DOORS, Git, Linux, Jira, Azure DevOps, Robot Framework</w:t>
+        <w:t xml:space="preserve"> </w:t>
+      </w:r>
+      <w:r>
+        <w:t>Statistic</w:t>
+      </w:r>
+      <w:r>
+        <w:t>s</w:t>
+      </w:r>
+      <w:r>
+        <w:t xml:space="preserve">, </w:t>
+      </w:r>
+      <w:r>
+        <w:t xml:space="preserve">Git, </w:t>
+      </w:r>
+      <w:r>
+        <w:t xml:space="preserve">Data Visualization, </w:t>
+      </w:r>
+      <w:r>
+        <w:t>Linux, Jira, Azure DevOps,</w:t>
+      </w:r>
+      <w:r>
+        <w:t xml:space="preserve"> Tableau,</w:t>
+      </w:r>
+      <w:r>
+        <w:t xml:space="preserve"> </w:t>
+      </w:r>
+      <w:r>
+        <w:t xml:space="preserve">IBM DOORS, </w:t>
+      </w:r>
+      <w:r>
+        <w:t>Robot Framework</w:t>
       </w:r>
       <w:r>
         <w:br/>
@@ -196,7 +244,13 @@
         <w:t>Methodologies:</w:t>
       </w:r>
       <w:r>
-        <w:t xml:space="preserve"> Agile/Scrum, Systems Engineering, Verification &amp; Validation</w:t>
+        <w:t xml:space="preserve"> Agile/Scrum, Systems Engineering, </w:t>
+      </w:r>
+      <w:r>
+        <w:t xml:space="preserve">Integration &amp; Test, </w:t>
+      </w:r>
+      <w:r>
+        <w:t>Verification &amp; Validation</w:t>
       </w:r>
     </w:p>
     <w:p>
@@ -416,6 +470,7 @@
         <w:spacing w:before="0" w:after="0"/>
       </w:pPr>
       <w:r>
+        <w:lastRenderedPageBreak/>
         <w:t>Supported live aircraft missions and field test</w:t>
       </w:r>
       <w:r>
@@ -447,7 +502,6 @@
         <w:spacing w:before="0" w:after="0"/>
       </w:pPr>
       <w:r>
-        <w:lastRenderedPageBreak/>
         <w:t xml:space="preserve">Rebuilt team-wide test, analysis, and metrics tracking processes, improving visibility and efficiency </w:t>
       </w:r>
     </w:p>
@@ -461,15 +515,13 @@
         <w:spacing w:before="0" w:after="0"/>
       </w:pPr>
       <w:r>
-        <w:t xml:space="preserve">Developed test conducting software to collect data during system testing to be stored and auto-analyzed through SQL and </w:t>
-      </w:r>
-      <w:proofErr w:type="spellStart"/>
-      <w:r>
-        <w:t>Matlab</w:t>
-      </w:r>
-      <w:proofErr w:type="spellEnd"/>
-      <w:r>
-        <w:t xml:space="preserve"> routines. Created dashboards for weekly metrics in Grafana.</w:t>
+        <w:t>Developed test conducting software to collect data during system testing to be stored and auto-analyzed through SQL and M</w:t>
+      </w:r>
+      <w:r>
+        <w:t xml:space="preserve">ATLAB </w:t>
+      </w:r>
+      <w:r>
+        <w:t>routines. Created dashboards for weekly metrics in Grafana.</w:t>
       </w:r>
     </w:p>
     <w:p>
@@ -790,6 +842,98 @@
       <w:bookmarkEnd w:id="9"/>
       <w:r>
         <w:t>CERTIFICATIONS &amp; HONORS</w:t>
+      </w:r>
+    </w:p>
+    <w:p>
+      <w:pPr>
+        <w:pStyle w:val="Compact"/>
+        <w:numPr>
+          <w:ilvl w:val="0"/>
+          <w:numId w:val="2"/>
+        </w:numPr>
+      </w:pPr>
+      <w:r>
+        <w:t xml:space="preserve">Data Science Infinity Certification – </w:t>
+      </w:r>
+      <w:r>
+        <w:rPr>
+          <w:i/>
+          <w:iCs/>
+        </w:rPr>
+        <w:t>ongoing</w:t>
+      </w:r>
+    </w:p>
+    <w:p>
+      <w:pPr>
+        <w:pStyle w:val="Compact"/>
+        <w:numPr>
+          <w:ilvl w:val="1"/>
+          <w:numId w:val="2"/>
+        </w:numPr>
+        <w:rPr>
+          <w:color w:val="C00000"/>
+        </w:rPr>
+      </w:pPr>
+      <w:r>
+        <w:rPr>
+          <w:color w:val="000000" w:themeColor="text1"/>
+        </w:rPr>
+        <w:lastRenderedPageBreak/>
+        <w:t>Learn</w:t>
+      </w:r>
+      <w:r>
+        <w:rPr>
+          <w:color w:val="000000" w:themeColor="text1"/>
+        </w:rPr>
+        <w:t>ed Material</w:t>
+      </w:r>
+      <w:r>
+        <w:rPr>
+          <w:color w:val="000000" w:themeColor="text1"/>
+        </w:rPr>
+        <w:t>: Extracting &amp; manipulating data using SQL</w:t>
+      </w:r>
+      <w:r>
+        <w:rPr>
+          <w:color w:val="000000" w:themeColor="text1"/>
+        </w:rPr>
+        <w:t xml:space="preserve"> and Python</w:t>
+      </w:r>
+      <w:r>
+        <w:rPr>
+          <w:color w:val="000000" w:themeColor="text1"/>
+        </w:rPr>
+        <w:t xml:space="preserve">. Application of statistical concepts such as hypothesis tests for measuring the effect of AB Tests. </w:t>
+      </w:r>
+      <w:r>
+        <w:rPr>
+          <w:color w:val="000000" w:themeColor="text1"/>
+        </w:rPr>
+        <w:t>Visualizing</w:t>
+      </w:r>
+      <w:r>
+        <w:rPr>
+          <w:color w:val="000000" w:themeColor="text1"/>
+        </w:rPr>
+        <w:t xml:space="preserve"> data with Python and Tableau. </w:t>
+      </w:r>
+      <w:r>
+        <w:rPr>
+          <w:color w:val="000000" w:themeColor="text1"/>
+        </w:rPr>
+        <w:t xml:space="preserve">Utilizing </w:t>
+      </w:r>
+      <w:r>
+        <w:rPr>
+          <w:color w:val="000000" w:themeColor="text1"/>
+        </w:rPr>
+        <w:t>GitHub</w:t>
+      </w:r>
+      <w:r>
+        <w:rPr>
+          <w:color w:val="000000" w:themeColor="text1"/>
+        </w:rPr>
+        <w:t xml:space="preserve"> for collaboration and version control. </w:t>
       </w:r>
     </w:p>
     <w:p>
@@ -832,7 +976,7 @@
 </file>
 
 <file path=word/numbering.xml><?xml version="1.0" encoding="utf-8"?>
-<w:numbering xmlns:wpc="http://schemas.microsoft.com/office/word/2010/wordprocessingCanvas" xmlns:cx="http://schemas.microsoft.com/office/drawing/2014/chartex" xmlns:cx1="http://schemas.microsoft.com/office/drawing/2015/9/8/chartex" xmlns:cx2="http://schemas.microsoft.com/office/drawing/2015/10/21/chartex" xmlns:cx3="http://schemas.microsoft.com/office/drawing/2016/5/9/chartex" xmlns:cx4="http://schemas.microsoft.com/office/drawing/2016/5/10/chartex" xmlns:cx5="http://schemas.microsoft.com/office/drawing/2016/5/11/chartex" xmlns:cx6="http://schemas.microsoft.com/office/drawing/2016/5/12/chartex" xmlns:cx7="http://schemas.microsoft.com/office/drawing/2016/5/13/chartex" xmlns:cx8="http://schemas.microsoft.com/office/drawing/2016/5/14/chartex" xmlns:mc="http://schemas.openxmlformats.org/markup-compatibility/2006" xmlns:aink="http://schemas.microsoft.com/office/drawing/2016/ink" xmlns:am3d="http://schemas.microsoft.com/office/drawing/2017/model3d" xmlns:o="urn:schemas-microsoft-com:office:office" xmlns:oel="http://schemas.microsoft.com/office/2019/extlst" xmlns:r="http://schemas.openxmlformats.org/officeDocument/2006/relationships" xmlns:m="http://schemas.openxmlformats.org/officeDocument/2006/math" xmlns:v="urn:schemas-microsoft-com:vml" xmlns:wp14="http://schemas.microsoft.com/office/word/2010/wordprocessingDrawing" xmlns:wp="http://schemas.openxmlformats.org/drawingml/2006/wordprocessingDrawing" xmlns:w10="urn:schemas-microsoft-com:office:word" xmlns:w="http://schemas.openxmlformats.org/wordprocessingml/2006/main" xmlns:w14="http://schemas.microsoft.com/office/word/2010/wordml" xmlns:w15="http://schemas.microsoft.com/office/word/2012/wordml" xmlns:w16cex="http://schemas.microsoft.com/office/word/2018/wordml/cex" xmlns:w16cid="http://schemas.microsoft.com/office/word/2016/wordml/cid" xmlns:w16="http://schemas.microsoft.com/office/word/2018/wordml" xmlns:w16du="http://schemas.microsoft.com/office/word/2023/wordml/word16du" xmlns:w16sdtdh="http://schemas.microsoft.com/office/word/2020/wordml/sdtdatahash" xmlns:w16sdtfl="http://schemas.microsoft.com/office/word/2024/wordml/sdtformatlock" xmlns:w16se="http://schemas.microsoft.com/office/word/2015/wordml/symex" xmlns:wpg="http://schemas.microsoft.com/office/word/2010/wordprocessingGroup" xmlns:wpi="http://schemas.microsoft.com/office/word/2010/wordprocessingInk" xmlns:wne="http://schemas.microsoft.com/office/word/2006/wordml" xmlns:wps="http://schemas.microsoft.com/office/word/2010/wordprocessingShape" mc:Ignorable="w14 w15 w16se w16cid w16 w16cex w16sdtdh w16sdtfl w16du wp14">
+<w:numbering xmlns:wpc="http://schemas.microsoft.com/office/word/2010/wordprocessingCanvas" xmlns:cx="http://schemas.microsoft.com/office/drawing/2014/chartex" xmlns:cx1="http://schemas.microsoft.com/office/drawing/2015/9/8/chartex" xmlns:cx2="http://schemas.microsoft.com/office/drawing/2015/10/21/chartex" xmlns:cx3="http://schemas.microsoft.com/office/drawing/2016/5/9/chartex" xmlns:cx4="http://schemas.microsoft.com/office/drawing/2016/5/10/chartex" xmlns:cx5="http://schemas.microsoft.com/office/drawing/2016/5/11/chartex" xmlns:cx6="http://schemas.microsoft.com/office/drawing/2016/5/12/chartex" xmlns:cx7="http://schemas.microsoft.com/office/drawing/2016/5/13/chartex" xmlns:cx8="http://schemas.microsoft.com/office/drawing/2016/5/14/chartex" xmlns:mc="http://schemas.openxmlformats.org/markup-compatibility/2006" xmlns:aink="http://schemas.microsoft.com/office/drawing/2016/ink" xmlns:am3d="http://schemas.microsoft.com/office/drawing/2017/model3d" xmlns:o="urn:schemas-microsoft-com:office:office" xmlns:oel="http://schemas.microsoft.com/office/2019/extlst" xmlns:r="http://schemas.openxmlformats.org/officeDocument/2006/relationships" xmlns:m="http://schemas.openxmlformats.org/officeDocument/2006/math" xmlns:v="urn:schemas-microsoft-com:vml" xmlns:wp14="http://schemas.microsoft.com/office/word/2010/wordprocessingDrawing" xmlns:wp="http://schemas.openxmlformats.org/drawingml/2006/wordprocessingDrawing" xmlns:w10="urn:schemas-microsoft-com:office:word" xmlns:w="http://schemas.openxmlformats.org/wordprocessingml/2006/main" xmlns:w14="http://schemas.microsoft.com/office/word/2010/wordml" xmlns:w15="http://schemas.microsoft.com/office/word/2012/wordml" xmlns:w16cei="http://schemas.microsoft.com/office/word/2026/wordml/cei" xmlns:w16cex="http://schemas.microsoft.com/office/word/2018/wordml/cex" xmlns:w16cid="http://schemas.microsoft.com/office/word/2016/wordml/cid" xmlns:w16="http://schemas.microsoft.com/office/word/2018/wordml" xmlns:w16du="http://schemas.microsoft.com/office/word/2023/wordml/word16du" xmlns:w16sdtdh="http://schemas.microsoft.com/office/word/2020/wordml/sdtdatahash" xmlns:w16sdtfl="http://schemas.microsoft.com/office/word/2024/wordml/sdtformatlock" xmlns:w16se="http://schemas.microsoft.com/office/word/2015/wordml/symex" xmlns:wpg="http://schemas.microsoft.com/office/word/2010/wordprocessingGroup" xmlns:wpi="http://schemas.microsoft.com/office/word/2010/wordprocessingInk" xmlns:wne="http://schemas.microsoft.com/office/word/2006/wordml" xmlns:wps="http://schemas.microsoft.com/office/word/2010/wordprocessingShape" mc:Ignorable="w14 w15 w16se w16cid w16 w16cex w16sdtdh w16sdtfl w16du wp14">
   <w:abstractNum w:abstractNumId="0" w15:restartNumberingAfterBreak="0">
     <w:nsid w:val="0000A990"/>
     <w:multiLevelType w:val="multilevel"/>
@@ -913,7 +1057,7 @@
   <w:abstractNum w:abstractNumId="1" w15:restartNumberingAfterBreak="0">
     <w:nsid w:val="0000A991"/>
     <w:multiLevelType w:val="multilevel"/>
-    <w:tmpl w:val="896C8596"/>
+    <w:tmpl w:val="F9EC8DA0"/>
     <w:lvl w:ilvl="0">
       <w:numFmt w:val="bullet"/>
       <w:lvlText w:val=""/>
@@ -934,6 +1078,7 @@
       </w:pPr>
       <w:rPr>
         <w:rFonts w:ascii="Courier New" w:hAnsi="Courier New" w:cs="Courier New" w:hint="default"/>
+        <w:color w:val="000000" w:themeColor="text1"/>
       </w:rPr>
     </w:lvl>
     <w:lvl w:ilvl="2">
@@ -2639,15 +2784,6 @@
   </w:num>
   <w:num w:numId="16" w16cid:durableId="247271652">
     <w:abstractNumId w:val="13"/>
-    <w:lvlOverride w:ilvl="0"/>
-    <w:lvlOverride w:ilvl="1"/>
-    <w:lvlOverride w:ilvl="2"/>
-    <w:lvlOverride w:ilvl="3"/>
-    <w:lvlOverride w:ilvl="4"/>
-    <w:lvlOverride w:ilvl="5"/>
-    <w:lvlOverride w:ilvl="6"/>
-    <w:lvlOverride w:ilvl="7"/>
-    <w:lvlOverride w:ilvl="8"/>
   </w:num>
 </w:numbering>
 </file>

</xml_diff>

<commit_message>
Updated Resume with stronger TestForward description
</commit_message>
<xml_diff>
--- a/docs/antonia_iaquinta_resume.docx
+++ b/docs/antonia_iaquinta_resume.docx
@@ -252,6 +252,9 @@
       <w:r>
         <w:t>Verification &amp; Validation</w:t>
       </w:r>
+      <w:r>
+        <w:t>, Data Engineering</w:t>
+      </w:r>
     </w:p>
     <w:p>
       <w:r>
@@ -515,7 +518,25 @@
         <w:spacing w:before="0" w:after="0"/>
       </w:pPr>
       <w:r>
-        <w:t>Developed test conducting software to collect data during system testing to be stored and auto-analyzed through SQL and M</w:t>
+        <w:t xml:space="preserve">Developed </w:t>
+      </w:r>
+      <w:r>
+        <w:t>a data engineering tool</w:t>
+      </w:r>
+      <w:r>
+        <w:t xml:space="preserve"> to collect</w:t>
+      </w:r>
+      <w:r>
+        <w:t xml:space="preserve"> test</w:t>
+      </w:r>
+      <w:r>
+        <w:t xml:space="preserve"> data </w:t>
+      </w:r>
+      <w:r>
+        <w:t xml:space="preserve">in real time </w:t>
+      </w:r>
+      <w:r>
+        <w:t>to be stored and auto-analyzed through SQL and M</w:t>
       </w:r>
       <w:r>
         <w:t xml:space="preserve">ATLAB </w:t>

</xml_diff>

<commit_message>
resume updated to include new stats project, Ecommerce UI Improvements A/B test
</commit_message>
<xml_diff>
--- a/docs/antonia_iaquinta_resume.docx
+++ b/docs/antonia_iaquinta_resume.docx
@@ -56,55 +56,10 @@
       </w:r>
     </w:p>
     <w:p>
-      <w:r>
-        <w:pict w14:anchorId="4C66E609">
-          <v:rect id="_x0000_i1025" style="width:0;height:1.5pt" o:hralign="center" o:hrstd="t" o:hr="t"/>
-        </w:pict>
-      </w:r>
-    </w:p>
-    <w:p>
-      <w:pPr>
-        <w:pStyle w:val="Heading2"/>
-      </w:pPr>
       <w:bookmarkStart w:id="1" w:name="education"/>
       <w:r>
-        <w:t>EDUCATION</w:t>
-      </w:r>
-    </w:p>
-    <w:p>
-      <w:pPr>
-        <w:pStyle w:val="FirstParagraph"/>
-        <w:spacing w:after="0"/>
-      </w:pPr>
-      <w:r>
-        <w:rPr>
-          <w:b/>
-          <w:bCs/>
-        </w:rPr>
-        <w:t>Wentworth Institute of Technology</w:t>
-      </w:r>
-      <w:r>
-        <w:t>, Boston, MA</w:t>
-      </w:r>
-      <w:r>
-        <w:br/>
-        <w:t>Bachelor of Science in Mechanical Engineering</w:t>
-      </w:r>
-      <w:r>
-        <w:t xml:space="preserve">, </w:t>
-      </w:r>
-      <w:r>
-        <w:t>Minor: Aerospace Engineering</w:t>
-      </w:r>
-      <w:r>
-        <w:br/>
-        <w:t>Magna Cum Laude | GPA: 3.84 / 4.0</w:t>
-      </w:r>
-    </w:p>
-    <w:p>
-      <w:r>
         <w:pict w14:anchorId="2293D664">
-          <v:rect id="_x0000_i1026" style="width:0;height:1.5pt" o:hralign="center" o:hrstd="t" o:hr="t"/>
+          <v:rect id="_x0000_i1081" style="width:0;height:1.5pt" o:hralign="center" o:hrstd="t" o:hr="t"/>
         </w:pict>
       </w:r>
     </w:p>
@@ -220,19 +175,7 @@
         <w:t>Data Visualization</w:t>
       </w:r>
       <w:r>
-        <w:t xml:space="preserve"> (</w:t>
-      </w:r>
-      <w:r>
-        <w:t>Tableau</w:t>
-      </w:r>
-      <w:r>
-        <w:t xml:space="preserve"> &amp; </w:t>
-      </w:r>
-      <w:r>
-        <w:t>Grafana</w:t>
-      </w:r>
-      <w:r>
-        <w:t>)</w:t>
+        <w:t xml:space="preserve"> (Tableau &amp; Grafana)</w:t>
       </w:r>
       <w:r>
         <w:t xml:space="preserve">, </w:t>
@@ -288,7 +231,7 @@
     <w:p>
       <w:r>
         <w:pict w14:anchorId="1C947C1E">
-          <v:rect id="_x0000_i1027" style="width:0;height:1.5pt" o:hralign="center" o:hrstd="t" o:hr="t"/>
+          <v:rect id="_x0000_i1082" style="width:0;height:1.5pt" o:hralign="center" o:hrstd="t" o:hr="t"/>
         </w:pict>
       </w:r>
     </w:p>
@@ -437,7 +380,7 @@
     <w:p>
       <w:r>
         <w:pict w14:anchorId="076A50CF">
-          <v:rect id="_x0000_i1028" style="width:0;height:1.5pt" o:hralign="center" o:hrstd="t" o:hr="t"/>
+          <v:rect id="_x0000_i1083" style="width:0;height:1.5pt" o:hralign="center" o:hrstd="t" o:hr="t"/>
         </w:pict>
       </w:r>
     </w:p>
@@ -506,7 +449,6 @@
         <w:spacing w:before="0" w:after="0"/>
       </w:pPr>
       <w:r>
-        <w:lastRenderedPageBreak/>
         <w:t xml:space="preserve">Performed </w:t>
       </w:r>
       <w:proofErr w:type="spellStart"/>
@@ -632,13 +574,14 @@
         <w:spacing w:before="0" w:after="0"/>
       </w:pPr>
       <w:r>
+        <w:lastRenderedPageBreak/>
         <w:t>Implemented Agile Scrum practices on a 17-person integration team</w:t>
       </w:r>
     </w:p>
     <w:p>
       <w:r>
         <w:pict w14:anchorId="14AADABC">
-          <v:rect id="_x0000_i1029" style="width:0;height:1.5pt" o:hralign="center" o:hrstd="t" o:hr="t"/>
+          <v:rect id="_x0000_i1084" style="width:0;height:1.5pt" o:hralign="center" o:hrstd="t" o:hr="t"/>
         </w:pict>
       </w:r>
     </w:p>
@@ -724,7 +667,7 @@
     <w:p>
       <w:r>
         <w:pict w14:anchorId="79962759">
-          <v:rect id="_x0000_i1030" style="width:0;height:1.5pt" o:hralign="center" o:hrstd="t" o:hr="t"/>
+          <v:rect id="_x0000_i1085" style="width:0;height:1.5pt" o:hralign="center" o:hrstd="t" o:hr="t"/>
         </w:pict>
       </w:r>
       <w:bookmarkStart w:id="7" w:name="bja-magnetics-leominster-ma"/>
@@ -739,6 +682,117 @@
       <w:bookmarkEnd w:id="7"/>
       <w:r>
         <w:t>PROJECTS &amp; ACTIVITIES</w:t>
+      </w:r>
+    </w:p>
+    <w:p>
+      <w:pPr>
+        <w:pStyle w:val="BodyText"/>
+        <w:spacing w:after="0"/>
+        <w:rPr>
+          <w:b/>
+          <w:bCs/>
+          <w:color w:val="00B050"/>
+        </w:rPr>
+      </w:pPr>
+      <w:r>
+        <w:rPr>
+          <w:b/>
+          <w:bCs/>
+        </w:rPr>
+        <w:t xml:space="preserve">Customer Checkout UI </w:t>
+      </w:r>
+      <w:r>
+        <w:rPr>
+          <w:b/>
+          <w:bCs/>
+        </w:rPr>
+        <w:t>Redesign Experiment</w:t>
+      </w:r>
+    </w:p>
+    <w:p>
+      <w:pPr>
+        <w:pStyle w:val="BodyText"/>
+        <w:numPr>
+          <w:ilvl w:val="0"/>
+          <w:numId w:val="17"/>
+        </w:numPr>
+        <w:spacing w:before="0" w:after="0"/>
+        <w:rPr>
+          <w:color w:val="00B050"/>
+        </w:rPr>
+      </w:pPr>
+      <w:r>
+        <w:t xml:space="preserve">Executed a </w:t>
+      </w:r>
+      <w:r>
+        <w:t xml:space="preserve">30-day </w:t>
+      </w:r>
+      <w:r>
+        <w:rPr>
+          <w:b/>
+          <w:bCs/>
+        </w:rPr>
+        <w:t>A/B experiment</w:t>
+      </w:r>
+      <w:r>
+        <w:t xml:space="preserve"> evaluating a redesigned checkout </w:t>
+      </w:r>
+      <w:r>
+        <w:t>user interface (UI)</w:t>
+      </w:r>
+      <w:r>
+        <w:t xml:space="preserve"> for an e-commerce website. A</w:t>
+      </w:r>
+      <w:r>
+        <w:t>ppl</w:t>
+      </w:r>
+      <w:r>
+        <w:t>ied</w:t>
+      </w:r>
+      <w:r>
+        <w:t xml:space="preserve"> </w:t>
+      </w:r>
+      <w:r>
+        <w:t>the</w:t>
+      </w:r>
+      <w:r>
+        <w:t xml:space="preserve"> </w:t>
+      </w:r>
+      <w:r>
+        <w:rPr>
+          <w:b/>
+          <w:bCs/>
+        </w:rPr>
+        <w:t xml:space="preserve">Z-Test for Proportions </w:t>
+      </w:r>
+      <w:r>
+        <w:t xml:space="preserve">to confirm a </w:t>
+      </w:r>
+      <w:r>
+        <w:rPr>
+          <w:b/>
+          <w:bCs/>
+        </w:rPr>
+        <w:t>+47.03% relative lift in conversion rate</w:t>
+      </w:r>
+      <w:r>
+        <w:t xml:space="preserve"> (40.21% to 59.13%) and a two-sided </w:t>
+      </w:r>
+      <w:r>
+        <w:rPr>
+          <w:b/>
+          <w:bCs/>
+        </w:rPr>
+        <w:t>Mann-Whitney U Test</w:t>
+      </w:r>
+      <w:r>
+        <w:t xml:space="preserve"> to verify no statistical degradation in Average Order Value (AOV)</w:t>
+      </w:r>
+      <w:r>
+        <w:t xml:space="preserve">. </w:t>
+      </w:r>
+      <w:r>
+        <w:t>Provided data-backed rollout recommendations to optimize checkout efficiency without sacrificing revenue per transaction.</w:t>
       </w:r>
     </w:p>
     <w:p>
@@ -762,62 +816,87 @@
         <w:pStyle w:val="BodyText"/>
         <w:numPr>
           <w:ilvl w:val="0"/>
-          <w:numId w:val="10"/>
+          <w:numId w:val="17"/>
         </w:numPr>
         <w:spacing w:before="0" w:after="0"/>
       </w:pPr>
       <w:r>
-        <w:t xml:space="preserve">Performed trade studies </w:t>
-      </w:r>
-      <w:r>
-        <w:t xml:space="preserve">to </w:t>
-      </w:r>
-      <w:r>
-        <w:t>design a dual-spool mixed-flow turbofan for Mach 1.6–1.8 commercial transport; evaluated thermodynamic performance using EES code.</w:t>
+        <w:t xml:space="preserve">Conducted trade studies to design a dual-spool mixed-flow turbofan and 2D supersonic inlet using </w:t>
+      </w:r>
+      <w:r>
+        <w:rPr>
+          <w:b/>
+          <w:bCs/>
+        </w:rPr>
+        <w:t>EES</w:t>
+      </w:r>
+      <w:r>
+        <w:t xml:space="preserve"> and </w:t>
+      </w:r>
+      <w:r>
+        <w:rPr>
+          <w:b/>
+          <w:bCs/>
+        </w:rPr>
+        <w:t>NASA SUPIN code</w:t>
+      </w:r>
+      <w:r>
+        <w:t xml:space="preserve">, achieving a </w:t>
+      </w:r>
+      <w:r>
+        <w:rPr>
+          <w:b/>
+          <w:bCs/>
+        </w:rPr>
+        <w:t>3.5% TSFC efficiency improvement</w:t>
+      </w:r>
+      <w:r>
+        <w:t xml:space="preserve"> for Mach 1.6–1.8 commercial transport</w:t>
       </w:r>
     </w:p>
     <w:p>
-      <w:pPr>
-        <w:pStyle w:val="FirstParagraph"/>
-        <w:numPr>
-          <w:ilvl w:val="0"/>
-          <w:numId w:val="10"/>
-        </w:numPr>
-        <w:spacing w:before="0" w:after="120"/>
-      </w:pPr>
-      <w:r>
-        <w:t xml:space="preserve">Modeled a 2D external compression inlet using </w:t>
-      </w:r>
-      <w:r>
-        <w:t>SUPIN (</w:t>
-      </w:r>
-      <w:proofErr w:type="spellStart"/>
-      <w:r>
-        <w:t>SUPersonic</w:t>
-      </w:r>
-      <w:proofErr w:type="spellEnd"/>
-      <w:r>
-        <w:t xml:space="preserve"> </w:t>
-      </w:r>
-      <w:proofErr w:type="spellStart"/>
-      <w:r>
-        <w:t>INlet</w:t>
-      </w:r>
-      <w:proofErr w:type="spellEnd"/>
-      <w:r>
-        <w:t>)</w:t>
-      </w:r>
-      <w:r>
-        <w:t>, NASA Fortran code, achieving a 3.5% Thrust Specific Fuel Consumption improvement</w:t>
-      </w:r>
-      <w:r>
-        <w:t>.</w:t>
+      <w:r>
+        <w:pict w14:anchorId="0F40A075">
+          <v:rect id="_x0000_i1093" style="width:0;height:1.5pt" o:hralign="center" o:hrstd="t" o:hr="t"/>
+        </w:pict>
       </w:r>
     </w:p>
     <w:p>
+      <w:pPr>
+        <w:pStyle w:val="Heading2"/>
+      </w:pPr>
+      <w:r>
+        <w:t>EDUCATION</w:t>
+      </w:r>
+    </w:p>
+    <w:p>
+      <w:pPr>
+        <w:pStyle w:val="FirstParagraph"/>
+        <w:spacing w:after="0"/>
+      </w:pPr>
+      <w:r>
+        <w:rPr>
+          <w:b/>
+          <w:bCs/>
+        </w:rPr>
+        <w:t>Wentworth Institute of Technology</w:t>
+      </w:r>
+      <w:r>
+        <w:t>, Boston, MA</w:t>
+      </w:r>
+      <w:r>
+        <w:br/>
+        <w:t>Bachelor of Science in Mechanical Engineering, Minor: Aerospace Engineering</w:t>
+      </w:r>
+      <w:r>
+        <w:br/>
+        <w:t>Magna Cum Laude | GPA: 3.84 / 4.0</w:t>
+      </w:r>
+    </w:p>
+    <w:p>
       <w:r>
         <w:pict w14:anchorId="18103E9C">
-          <v:rect id="_x0000_i1032" style="width:0;height:1.5pt" o:hralign="center" o:hrstd="t" o:hr="t"/>
+          <v:rect id="_x0000_i1086" style="width:0;height:1.5pt" o:hralign="center" o:bullet="t" o:hrstd="t" o:hr="t"/>
         </w:pict>
       </w:r>
     </w:p>
@@ -963,6 +1042,11 @@
 
 <file path=word/numbering.xml><?xml version="1.0" encoding="utf-8"?>
 <w:numbering xmlns:wpc="http://schemas.microsoft.com/office/word/2010/wordprocessingCanvas" xmlns:cx="http://schemas.microsoft.com/office/drawing/2014/chartex" xmlns:cx1="http://schemas.microsoft.com/office/drawing/2015/9/8/chartex" xmlns:cx2="http://schemas.microsoft.com/office/drawing/2015/10/21/chartex" xmlns:cx3="http://schemas.microsoft.com/office/drawing/2016/5/9/chartex" xmlns:cx4="http://schemas.microsoft.com/office/drawing/2016/5/10/chartex" xmlns:cx5="http://schemas.microsoft.com/office/drawing/2016/5/11/chartex" xmlns:cx6="http://schemas.microsoft.com/office/drawing/2016/5/12/chartex" xmlns:cx7="http://schemas.microsoft.com/office/drawing/2016/5/13/chartex" xmlns:cx8="http://schemas.microsoft.com/office/drawing/2016/5/14/chartex" xmlns:mc="http://schemas.openxmlformats.org/markup-compatibility/2006" xmlns:aink="http://schemas.microsoft.com/office/drawing/2016/ink" xmlns:am3d="http://schemas.microsoft.com/office/drawing/2017/model3d" xmlns:o="urn:schemas-microsoft-com:office:office" xmlns:oel="http://schemas.microsoft.com/office/2019/extlst" xmlns:r="http://schemas.openxmlformats.org/officeDocument/2006/relationships" xmlns:m="http://schemas.openxmlformats.org/officeDocument/2006/math" xmlns:v="urn:schemas-microsoft-com:vml" xmlns:wp14="http://schemas.microsoft.com/office/word/2010/wordprocessingDrawing" xmlns:wp="http://schemas.openxmlformats.org/drawingml/2006/wordprocessingDrawing" xmlns:w10="urn:schemas-microsoft-com:office:word" xmlns:w="http://schemas.openxmlformats.org/wordprocessingml/2006/main" xmlns:w14="http://schemas.microsoft.com/office/word/2010/wordml" xmlns:w15="http://schemas.microsoft.com/office/word/2012/wordml" xmlns:w16cei="http://schemas.microsoft.com/office/word/2026/wordml/cei" xmlns:w16cex="http://schemas.microsoft.com/office/word/2018/wordml/cex" xmlns:w16cid="http://schemas.microsoft.com/office/word/2016/wordml/cid" xmlns:w16="http://schemas.microsoft.com/office/word/2018/wordml" xmlns:w16du="http://schemas.microsoft.com/office/word/2023/wordml/word16du" xmlns:w16sdtdh="http://schemas.microsoft.com/office/word/2020/wordml/sdtdatahash" xmlns:w16sdtfl="http://schemas.microsoft.com/office/word/2024/wordml/sdtformatlock" xmlns:w16se="http://schemas.microsoft.com/office/word/2015/wordml/symex" xmlns:wpg="http://schemas.microsoft.com/office/word/2010/wordprocessingGroup" xmlns:wpi="http://schemas.microsoft.com/office/word/2010/wordprocessingInk" xmlns:wne="http://schemas.microsoft.com/office/word/2006/wordml" xmlns:wps="http://schemas.microsoft.com/office/word/2010/wordprocessingShape" mc:Ignorable="w14 w15 w16se w16cid w16 w16cex w16sdtdh w16sdtfl w16du wp14">
+  <w:numPicBullet w:numPicBulletId="0">
+    <w:pict>
+      <v:rect id="_x0000_i1025" style="width:0;height:1.5pt" o:hralign="center" o:bullet="t" o:hrstd="t" o:hr="t"/>
+    </w:pict>
+  </w:numPicBullet>
   <w:abstractNum w:abstractNumId="0" w15:restartNumberingAfterBreak="0">
     <w:nsid w:val="0000A990"/>
     <w:multiLevelType w:val="multilevel"/>
@@ -1484,6 +1568,120 @@
     </w:lvl>
   </w:abstractNum>
   <w:abstractNum w:abstractNumId="5" w15:restartNumberingAfterBreak="0">
+    <w:nsid w:val="146C260F"/>
+    <w:multiLevelType w:val="hybridMultilevel"/>
+    <w:tmpl w:val="4D9018BE"/>
+    <w:lvl w:ilvl="0" w:tplc="9F621DCE">
+      <w:start w:val="1"/>
+      <w:numFmt w:val="bullet"/>
+      <w:lvlText w:val=""/>
+      <w:lvlJc w:val="left"/>
+      <w:pPr>
+        <w:ind w:left="720" w:hanging="360"/>
+      </w:pPr>
+      <w:rPr>
+        <w:rFonts w:ascii="Symbol" w:hAnsi="Symbol" w:hint="default"/>
+        <w:color w:val="auto"/>
+      </w:rPr>
+    </w:lvl>
+    <w:lvl w:ilvl="1" w:tplc="04090003" w:tentative="1">
+      <w:start w:val="1"/>
+      <w:numFmt w:val="bullet"/>
+      <w:lvlText w:val="o"/>
+      <w:lvlJc w:val="left"/>
+      <w:pPr>
+        <w:ind w:left="1440" w:hanging="360"/>
+      </w:pPr>
+      <w:rPr>
+        <w:rFonts w:ascii="Courier New" w:hAnsi="Courier New" w:cs="Courier New" w:hint="default"/>
+      </w:rPr>
+    </w:lvl>
+    <w:lvl w:ilvl="2" w:tplc="04090005" w:tentative="1">
+      <w:start w:val="1"/>
+      <w:numFmt w:val="bullet"/>
+      <w:lvlText w:val=""/>
+      <w:lvlJc w:val="left"/>
+      <w:pPr>
+        <w:ind w:left="2160" w:hanging="360"/>
+      </w:pPr>
+      <w:rPr>
+        <w:rFonts w:ascii="Wingdings" w:hAnsi="Wingdings" w:hint="default"/>
+      </w:rPr>
+    </w:lvl>
+    <w:lvl w:ilvl="3" w:tplc="04090001" w:tentative="1">
+      <w:start w:val="1"/>
+      <w:numFmt w:val="bullet"/>
+      <w:lvlText w:val=""/>
+      <w:lvlJc w:val="left"/>
+      <w:pPr>
+        <w:ind w:left="2880" w:hanging="360"/>
+      </w:pPr>
+      <w:rPr>
+        <w:rFonts w:ascii="Symbol" w:hAnsi="Symbol" w:hint="default"/>
+      </w:rPr>
+    </w:lvl>
+    <w:lvl w:ilvl="4" w:tplc="04090003" w:tentative="1">
+      <w:start w:val="1"/>
+      <w:numFmt w:val="bullet"/>
+      <w:lvlText w:val="o"/>
+      <w:lvlJc w:val="left"/>
+      <w:pPr>
+        <w:ind w:left="3600" w:hanging="360"/>
+      </w:pPr>
+      <w:rPr>
+        <w:rFonts w:ascii="Courier New" w:hAnsi="Courier New" w:cs="Courier New" w:hint="default"/>
+      </w:rPr>
+    </w:lvl>
+    <w:lvl w:ilvl="5" w:tplc="04090005" w:tentative="1">
+      <w:start w:val="1"/>
+      <w:numFmt w:val="bullet"/>
+      <w:lvlText w:val=""/>
+      <w:lvlJc w:val="left"/>
+      <w:pPr>
+        <w:ind w:left="4320" w:hanging="360"/>
+      </w:pPr>
+      <w:rPr>
+        <w:rFonts w:ascii="Wingdings" w:hAnsi="Wingdings" w:hint="default"/>
+      </w:rPr>
+    </w:lvl>
+    <w:lvl w:ilvl="6" w:tplc="04090001" w:tentative="1">
+      <w:start w:val="1"/>
+      <w:numFmt w:val="bullet"/>
+      <w:lvlText w:val=""/>
+      <w:lvlJc w:val="left"/>
+      <w:pPr>
+        <w:ind w:left="5040" w:hanging="360"/>
+      </w:pPr>
+      <w:rPr>
+        <w:rFonts w:ascii="Symbol" w:hAnsi="Symbol" w:hint="default"/>
+      </w:rPr>
+    </w:lvl>
+    <w:lvl w:ilvl="7" w:tplc="04090003" w:tentative="1">
+      <w:start w:val="1"/>
+      <w:numFmt w:val="bullet"/>
+      <w:lvlText w:val="o"/>
+      <w:lvlJc w:val="left"/>
+      <w:pPr>
+        <w:ind w:left="5760" w:hanging="360"/>
+      </w:pPr>
+      <w:rPr>
+        <w:rFonts w:ascii="Courier New" w:hAnsi="Courier New" w:cs="Courier New" w:hint="default"/>
+      </w:rPr>
+    </w:lvl>
+    <w:lvl w:ilvl="8" w:tplc="04090005" w:tentative="1">
+      <w:start w:val="1"/>
+      <w:numFmt w:val="bullet"/>
+      <w:lvlText w:val=""/>
+      <w:lvlJc w:val="left"/>
+      <w:pPr>
+        <w:ind w:left="6480" w:hanging="360"/>
+      </w:pPr>
+      <w:rPr>
+        <w:rFonts w:ascii="Wingdings" w:hAnsi="Wingdings" w:hint="default"/>
+      </w:rPr>
+    </w:lvl>
+  </w:abstractNum>
+  <w:abstractNum w:abstractNumId="6" w15:restartNumberingAfterBreak="0">
     <w:nsid w:val="16C11A0E"/>
     <w:multiLevelType w:val="hybridMultilevel"/>
     <w:tmpl w:val="33E41CAE"/>
@@ -1596,7 +1794,7 @@
       </w:rPr>
     </w:lvl>
   </w:abstractNum>
-  <w:abstractNum w:abstractNumId="6" w15:restartNumberingAfterBreak="0">
+  <w:abstractNum w:abstractNumId="7" w15:restartNumberingAfterBreak="0">
     <w:nsid w:val="1E9A3BD0"/>
     <w:multiLevelType w:val="hybridMultilevel"/>
     <w:tmpl w:val="81F4CDF6"/>
@@ -1708,7 +1906,7 @@
       </w:rPr>
     </w:lvl>
   </w:abstractNum>
-  <w:abstractNum w:abstractNumId="7" w15:restartNumberingAfterBreak="0">
+  <w:abstractNum w:abstractNumId="8" w15:restartNumberingAfterBreak="0">
     <w:nsid w:val="283F3754"/>
     <w:multiLevelType w:val="hybridMultilevel"/>
     <w:tmpl w:val="89CC0052"/>
@@ -1821,7 +2019,7 @@
       </w:rPr>
     </w:lvl>
   </w:abstractNum>
-  <w:abstractNum w:abstractNumId="8" w15:restartNumberingAfterBreak="0">
+  <w:abstractNum w:abstractNumId="9" w15:restartNumberingAfterBreak="0">
     <w:nsid w:val="2F853AED"/>
     <w:multiLevelType w:val="hybridMultilevel"/>
     <w:tmpl w:val="6406D842"/>
@@ -1934,7 +2132,7 @@
       </w:rPr>
     </w:lvl>
   </w:abstractNum>
-  <w:abstractNum w:abstractNumId="9" w15:restartNumberingAfterBreak="0">
+  <w:abstractNum w:abstractNumId="10" w15:restartNumberingAfterBreak="0">
     <w:nsid w:val="3C387E80"/>
     <w:multiLevelType w:val="hybridMultilevel"/>
     <w:tmpl w:val="DAE64B52"/>
@@ -2047,7 +2245,7 @@
       </w:rPr>
     </w:lvl>
   </w:abstractNum>
-  <w:abstractNum w:abstractNumId="10" w15:restartNumberingAfterBreak="0">
+  <w:abstractNum w:abstractNumId="11" w15:restartNumberingAfterBreak="0">
     <w:nsid w:val="56F82C3B"/>
     <w:multiLevelType w:val="hybridMultilevel"/>
     <w:tmpl w:val="7D34B7EA"/>
@@ -2159,7 +2357,7 @@
       </w:rPr>
     </w:lvl>
   </w:abstractNum>
-  <w:abstractNum w:abstractNumId="11" w15:restartNumberingAfterBreak="0">
+  <w:abstractNum w:abstractNumId="12" w15:restartNumberingAfterBreak="0">
     <w:nsid w:val="59AC5BD6"/>
     <w:multiLevelType w:val="hybridMultilevel"/>
     <w:tmpl w:val="FF8AE0DA"/>
@@ -2271,7 +2469,7 @@
       </w:rPr>
     </w:lvl>
   </w:abstractNum>
-  <w:abstractNum w:abstractNumId="12" w15:restartNumberingAfterBreak="0">
+  <w:abstractNum w:abstractNumId="13" w15:restartNumberingAfterBreak="0">
     <w:nsid w:val="669F3314"/>
     <w:multiLevelType w:val="hybridMultilevel"/>
     <w:tmpl w:val="89B8E9E2"/>
@@ -2383,7 +2581,7 @@
       </w:rPr>
     </w:lvl>
   </w:abstractNum>
-  <w:abstractNum w:abstractNumId="13" w15:restartNumberingAfterBreak="0">
+  <w:abstractNum w:abstractNumId="14" w15:restartNumberingAfterBreak="0">
     <w:nsid w:val="66DA12B9"/>
     <w:multiLevelType w:val="hybridMultilevel"/>
     <w:tmpl w:val="C0423450"/>
@@ -2497,7 +2695,7 @@
       </w:rPr>
     </w:lvl>
   </w:abstractNum>
-  <w:abstractNum w:abstractNumId="14" w15:restartNumberingAfterBreak="0">
+  <w:abstractNum w:abstractNumId="15" w15:restartNumberingAfterBreak="0">
     <w:nsid w:val="6BEA309E"/>
     <w:multiLevelType w:val="hybridMultilevel"/>
     <w:tmpl w:val="D45C5488"/>
@@ -2610,7 +2808,7 @@
       </w:rPr>
     </w:lvl>
   </w:abstractNum>
-  <w:abstractNum w:abstractNumId="15" w15:restartNumberingAfterBreak="0">
+  <w:abstractNum w:abstractNumId="16" w15:restartNumberingAfterBreak="0">
     <w:nsid w:val="78CA3174"/>
     <w:multiLevelType w:val="hybridMultilevel"/>
     <w:tmpl w:val="F3941AB8"/>
@@ -2730,28 +2928,28 @@
     <w:abstractNumId w:val="1"/>
   </w:num>
   <w:num w:numId="3" w16cid:durableId="1585727914">
-    <w:abstractNumId w:val="12"/>
+    <w:abstractNumId w:val="13"/>
   </w:num>
   <w:num w:numId="4" w16cid:durableId="279604378">
-    <w:abstractNumId w:val="6"/>
+    <w:abstractNumId w:val="7"/>
   </w:num>
   <w:num w:numId="5" w16cid:durableId="867178544">
-    <w:abstractNumId w:val="7"/>
+    <w:abstractNumId w:val="8"/>
   </w:num>
   <w:num w:numId="6" w16cid:durableId="1369143294">
-    <w:abstractNumId w:val="9"/>
+    <w:abstractNumId w:val="10"/>
   </w:num>
   <w:num w:numId="7" w16cid:durableId="196428787">
     <w:abstractNumId w:val="3"/>
   </w:num>
   <w:num w:numId="8" w16cid:durableId="986057700">
-    <w:abstractNumId w:val="10"/>
+    <w:abstractNumId w:val="11"/>
   </w:num>
   <w:num w:numId="9" w16cid:durableId="406197328">
-    <w:abstractNumId w:val="15"/>
+    <w:abstractNumId w:val="16"/>
   </w:num>
   <w:num w:numId="10" w16cid:durableId="1996296945">
-    <w:abstractNumId w:val="14"/>
+    <w:abstractNumId w:val="15"/>
   </w:num>
   <w:num w:numId="11" w16cid:durableId="1490516239">
     <w:abstractNumId w:val="4"/>
@@ -2760,16 +2958,19 @@
     <w:abstractNumId w:val="2"/>
   </w:num>
   <w:num w:numId="13" w16cid:durableId="1607806549">
-    <w:abstractNumId w:val="11"/>
+    <w:abstractNumId w:val="12"/>
   </w:num>
   <w:num w:numId="14" w16cid:durableId="1192183549">
-    <w:abstractNumId w:val="5"/>
+    <w:abstractNumId w:val="6"/>
   </w:num>
   <w:num w:numId="15" w16cid:durableId="1080714721">
-    <w:abstractNumId w:val="8"/>
+    <w:abstractNumId w:val="9"/>
   </w:num>
   <w:num w:numId="16" w16cid:durableId="247271652">
-    <w:abstractNumId w:val="13"/>
+    <w:abstractNumId w:val="14"/>
+  </w:num>
+  <w:num w:numId="17" w16cid:durableId="1851261852">
+    <w:abstractNumId w:val="5"/>
   </w:num>
 </w:numbering>
 </file>
@@ -3242,7 +3443,6 @@
   <w:style w:type="character" w:default="1" w:styleId="DefaultParagraphFont">
     <w:name w:val="Default Paragraph Font"/>
     <w:uiPriority w:val="1"/>
-    <w:semiHidden/>
     <w:unhideWhenUsed/>
   </w:style>
   <w:style w:type="table" w:default="1" w:styleId="TableNormal">

</xml_diff>

<commit_message>
minor project and resume updates (added both A/B projects to Resume and portfolio site)
</commit_message>
<xml_diff>
--- a/docs/antonia_iaquinta_resume.docx
+++ b/docs/antonia_iaquinta_resume.docx
@@ -59,7 +59,7 @@
       <w:bookmarkStart w:id="1" w:name="education"/>
       <w:r>
         <w:pict w14:anchorId="2293D664">
-          <v:rect id="_x0000_i1081" style="width:0;height:1.5pt" o:hralign="center" o:hrstd="t" o:hr="t"/>
+          <v:rect id="_x0000_i1026" style="width:0;height:1.5pt" o:hralign="center" o:hrstd="t" o:hr="t"/>
         </w:pict>
       </w:r>
     </w:p>
@@ -231,7 +231,7 @@
     <w:p>
       <w:r>
         <w:pict w14:anchorId="1C947C1E">
-          <v:rect id="_x0000_i1082" style="width:0;height:1.5pt" o:hralign="center" o:hrstd="t" o:hr="t"/>
+          <v:rect id="_x0000_i1027" style="width:0;height:1.5pt" o:hralign="center" o:hrstd="t" o:hr="t"/>
         </w:pict>
       </w:r>
     </w:p>
@@ -380,7 +380,7 @@
     <w:p>
       <w:r>
         <w:pict w14:anchorId="076A50CF">
-          <v:rect id="_x0000_i1083" style="width:0;height:1.5pt" o:hralign="center" o:hrstd="t" o:hr="t"/>
+          <v:rect id="_x0000_i1028" style="width:0;height:1.5pt" o:hralign="center" o:hrstd="t" o:hr="t"/>
         </w:pict>
       </w:r>
     </w:p>
@@ -581,7 +581,7 @@
     <w:p>
       <w:r>
         <w:pict w14:anchorId="14AADABC">
-          <v:rect id="_x0000_i1084" style="width:0;height:1.5pt" o:hralign="center" o:hrstd="t" o:hr="t"/>
+          <v:rect id="_x0000_i1029" style="width:0;height:1.5pt" o:hralign="center" o:hrstd="t" o:hr="t"/>
         </w:pict>
       </w:r>
     </w:p>
@@ -667,7 +667,7 @@
     <w:p>
       <w:r>
         <w:pict w14:anchorId="79962759">
-          <v:rect id="_x0000_i1085" style="width:0;height:1.5pt" o:hralign="center" o:hrstd="t" o:hr="t"/>
+          <v:rect id="_x0000_i1030" style="width:0;height:1.5pt" o:hralign="center" o:hrstd="t" o:hr="t"/>
         </w:pict>
       </w:r>
       <w:bookmarkStart w:id="7" w:name="bja-magnetics-leominster-ma"/>
@@ -681,7 +681,10 @@
       <w:bookmarkEnd w:id="3"/>
       <w:bookmarkEnd w:id="7"/>
       <w:r>
-        <w:t>PROJECTS &amp; ACTIVITIES</w:t>
+        <w:t xml:space="preserve">PORTFOLIO </w:t>
+      </w:r>
+      <w:r>
+        <w:t>PROJECTS</w:t>
       </w:r>
     </w:p>
     <w:p>
@@ -716,7 +719,7 @@
           <w:ilvl w:val="0"/>
           <w:numId w:val="17"/>
         </w:numPr>
-        <w:spacing w:before="0" w:after="0"/>
+        <w:spacing w:before="0" w:after="120"/>
         <w:rPr>
           <w:color w:val="00B050"/>
         </w:rPr>
@@ -741,22 +744,7 @@
         <w:t>user interface (UI)</w:t>
       </w:r>
       <w:r>
-        <w:t xml:space="preserve"> for an e-commerce website. A</w:t>
-      </w:r>
-      <w:r>
-        <w:t>ppl</w:t>
-      </w:r>
-      <w:r>
-        <w:t>ied</w:t>
-      </w:r>
-      <w:r>
-        <w:t xml:space="preserve"> </w:t>
-      </w:r>
-      <w:r>
-        <w:t>the</w:t>
-      </w:r>
-      <w:r>
-        <w:t xml:space="preserve"> </w:t>
+        <w:t xml:space="preserve"> for an e-commerce website. Applied the </w:t>
       </w:r>
       <w:r>
         <w:rPr>
@@ -786,29 +774,20 @@
         <w:t>Mann-Whitney U Test</w:t>
       </w:r>
       <w:r>
-        <w:t xml:space="preserve"> to verify no statistical degradation in Average Order Value (AOV)</w:t>
-      </w:r>
-      <w:r>
-        <w:t xml:space="preserve">. </w:t>
-      </w:r>
-      <w:r>
-        <w:t>Provided data-backed rollout recommendations to optimize checkout efficiency without sacrificing revenue per transaction.</w:t>
+        <w:t xml:space="preserve"> to verify no statistical degradation in Average Order Value (AOV). Provided data-backed rollout recommendations to optimize checkout efficiency without sacrificing revenue per transaction.</w:t>
       </w:r>
     </w:p>
     <w:p>
       <w:pPr>
         <w:pStyle w:val="BodyText"/>
-        <w:spacing w:after="0"/>
+        <w:spacing w:before="0" w:after="0"/>
       </w:pPr>
       <w:r>
         <w:rPr>
           <w:b/>
           <w:bCs/>
         </w:rPr>
-        <w:t>AIAA Design Competition – Supersonic Jet Engine Design</w:t>
-      </w:r>
-      <w:r>
-        <w:t xml:space="preserve"> | Oct 2017 – May 2018</w:t>
+        <w:t>Promotional Mailer Campaign Effectiveness</w:t>
       </w:r>
     </w:p>
     <w:p>
@@ -821,43 +800,117 @@
         <w:spacing w:before="0" w:after="0"/>
       </w:pPr>
       <w:r>
-        <w:t xml:space="preserve">Conducted trade studies to design a dual-spool mixed-flow turbofan and 2D supersonic inlet using </w:t>
+        <w:t xml:space="preserve">Executed an </w:t>
       </w:r>
       <w:r>
         <w:rPr>
           <w:b/>
           <w:bCs/>
         </w:rPr>
-        <w:t>EES</w:t>
-      </w:r>
-      <w:r>
-        <w:t xml:space="preserve"> and </w:t>
+        <w:t>A/B test</w:t>
+      </w:r>
+      <w:r>
+        <w:t xml:space="preserve"> evaluating the impact of low</w:t>
+      </w:r>
+      <w:r>
+        <w:t xml:space="preserve">-cost vs. high-cost promotional mailers for a grocery retailer’s </w:t>
+      </w:r>
+      <w:r>
+        <w:t>‘</w:t>
+      </w:r>
+      <w:r>
+        <w:t>Delivery Club</w:t>
+      </w:r>
+      <w:r>
+        <w:t>’</w:t>
+      </w:r>
+      <w:r>
+        <w:t xml:space="preserve"> membership</w:t>
+      </w:r>
+      <w:r>
+        <w:t xml:space="preserve"> campaign</w:t>
+      </w:r>
+      <w:r>
+        <w:t xml:space="preserve">. Applied </w:t>
+      </w:r>
+      <w:r>
+        <w:t>the</w:t>
+      </w:r>
+      <w:r>
+        <w:t xml:space="preserve"> </w:t>
       </w:r>
       <w:r>
         <w:rPr>
           <w:b/>
           <w:bCs/>
         </w:rPr>
-        <w:t>NASA SUPIN code</w:t>
-      </w:r>
-      <w:r>
-        <w:t xml:space="preserve">, achieving a </w:t>
-      </w:r>
-      <w:r>
-        <w:rPr>
-          <w:b/>
-          <w:bCs/>
-        </w:rPr>
-        <w:t>3.5% TSFC efficiency improvement</w:t>
-      </w:r>
-      <w:r>
-        <w:t xml:space="preserve"> for Mach 1.6–1.8 commercial transport</w:t>
+        <w:t>Chi-Square Test of Independence</w:t>
+      </w:r>
+      <w:r>
+        <w:t xml:space="preserve"> on campaign data to </w:t>
+      </w:r>
+      <w:r>
+        <w:t xml:space="preserve">determine </w:t>
+      </w:r>
+      <w:r>
+        <w:t xml:space="preserve">the observed 5% lift </w:t>
+      </w:r>
+      <w:r>
+        <w:t xml:space="preserve">in sign-ups </w:t>
+      </w:r>
+      <w:r>
+        <w:t>(32.8% vs. 37.8%)</w:t>
+      </w:r>
+      <w:r>
+        <w:t xml:space="preserve"> </w:t>
+      </w:r>
+      <w:r>
+        <w:t xml:space="preserve">was statistically insignificant and </w:t>
+      </w:r>
+      <w:r>
+        <w:t xml:space="preserve">likely </w:t>
+      </w:r>
+      <w:r>
+        <w:t>attribut</w:t>
+      </w:r>
+      <w:r>
+        <w:t>ed</w:t>
+      </w:r>
+      <w:r>
+        <w:t xml:space="preserve"> to random chance</w:t>
+      </w:r>
+      <w:r>
+        <w:t>.</w:t>
+      </w:r>
+      <w:r>
+        <w:t xml:space="preserve"> </w:t>
+      </w:r>
+      <w:r>
+        <w:t>Advised</w:t>
+      </w:r>
+      <w:r>
+        <w:t xml:space="preserve"> </w:t>
+      </w:r>
+      <w:r>
+        <w:t>against adopting the higher-cost mail</w:t>
+      </w:r>
+      <w:r>
+        <w:t xml:space="preserve"> for subsequent campaigns,</w:t>
+      </w:r>
+      <w:r>
+        <w:t xml:space="preserve"> preventing unnecessary marketing exp</w:t>
+      </w:r>
+      <w:r>
+        <w:t>enses.</w:t>
+      </w:r>
+      <w:r>
+        <w:t xml:space="preserve"> </w:t>
       </w:r>
     </w:p>
     <w:p>
       <w:r>
         <w:pict w14:anchorId="0F40A075">
-          <v:rect id="_x0000_i1093" style="width:0;height:1.5pt" o:hralign="center" o:hrstd="t" o:hr="t"/>
+          <v:rect id="_x0000_i1031" style="width:0;height:1.5pt" o:hralign="center" o:hrstd="t" o:hr="t"/>
         </w:pict>
       </w:r>
     </w:p>
@@ -896,7 +949,7 @@
     <w:p>
       <w:r>
         <w:pict w14:anchorId="18103E9C">
-          <v:rect id="_x0000_i1086" style="width:0;height:1.5pt" o:hralign="center" o:bullet="t" o:hrstd="t" o:hr="t"/>
+          <v:rect id="_x0000_i1032" style="width:0;height:1.5pt" o:hralign="center" o:bullet="t" o:hrstd="t" o:hr="t"/>
         </w:pict>
       </w:r>
     </w:p>
@@ -968,7 +1021,19 @@
         <w:rPr>
           <w:color w:val="000000" w:themeColor="text1"/>
         </w:rPr>
-        <w:t xml:space="preserve">. Application of statistical concepts such as hypothesis tests for measuring the effect of AB Tests. </w:t>
+        <w:t>. Application of statistical concepts such as hypothesis tests for measuring the effect of A</w:t>
+      </w:r>
+      <w:r>
+        <w:rPr>
+          <w:color w:val="000000" w:themeColor="text1"/>
+        </w:rPr>
+        <w:t>/</w:t>
+      </w:r>
+      <w:r>
+        <w:rPr>
+          <w:color w:val="000000" w:themeColor="text1"/>
+        </w:rPr>
+        <w:t xml:space="preserve">B Tests. </w:t>
       </w:r>
       <w:r>
         <w:rPr>

</xml_diff>

<commit_message>
added SciPy to resume
</commit_message>
<xml_diff>
--- a/docs/antonia_iaquinta_resume.docx
+++ b/docs/antonia_iaquinta_resume.docx
@@ -55,7 +55,7 @@
       <w:bookmarkStart w:id="1" w:name="education"/>
       <w:r>
         <w:pict w14:anchorId="2293D664">
-          <v:rect id="_x0000_i1058" style="width:0;height:1.5pt" o:hralign="center" o:hrstd="t" o:hr="t"/>
+          <v:rect id="_x0000_i1026" style="width:0;height:1.5pt" o:hralign="center" o:hrstd="t" o:hr="t"/>
         </w:pict>
       </w:r>
     </w:p>
@@ -99,16 +99,11 @@
       <w:r>
         <w:t xml:space="preserve">andas, </w:t>
       </w:r>
-      <w:proofErr w:type="spellStart"/>
       <w:r>
         <w:t>N</w:t>
       </w:r>
       <w:r>
-        <w:t>umpy</w:t>
-      </w:r>
-      <w:proofErr w:type="spellEnd"/>
-      <w:r>
-        <w:t xml:space="preserve">, </w:t>
+        <w:t xml:space="preserve">umpy, </w:t>
       </w:r>
       <w:r>
         <w:t>M</w:t>
@@ -116,16 +111,26 @@
       <w:r>
         <w:t xml:space="preserve">atplotlib, </w:t>
       </w:r>
-      <w:proofErr w:type="spellStart"/>
       <w:r>
         <w:t>S</w:t>
       </w:r>
       <w:r>
         <w:t>tatsmodels</w:t>
       </w:r>
-      <w:proofErr w:type="spellEnd"/>
-      <w:r>
-        <w:t xml:space="preserve">, </w:t>
+      <w:r>
+        <w:t>,</w:t>
+      </w:r>
+      <w:r>
+        <w:t xml:space="preserve"> Sci</w:t>
+      </w:r>
+      <w:r>
+        <w:t>P</w:t>
+      </w:r>
+      <w:r>
+        <w:t>y,</w:t>
+      </w:r>
+      <w:r>
+        <w:t xml:space="preserve"> </w:t>
       </w:r>
       <w:r>
         <w:t>Scikit-L</w:t>
@@ -233,7 +238,7 @@
     <w:p>
       <w:r>
         <w:pict w14:anchorId="1C947C1E">
-          <v:rect id="_x0000_i1059" style="width:0;height:1.5pt" o:hralign="center" o:hrstd="t" o:hr="t"/>
+          <v:rect id="_x0000_i1027" style="width:0;height:1.5pt" o:hralign="center" o:hrstd="t" o:hr="t"/>
         </w:pict>
       </w:r>
     </w:p>
@@ -390,7 +395,7 @@
     <w:p>
       <w:r>
         <w:pict w14:anchorId="076A50CF">
-          <v:rect id="_x0000_i1060" style="width:0;height:1.5pt" o:hralign="center" o:hrstd="t" o:hr="t"/>
+          <v:rect id="_x0000_i1028" style="width:0;height:1.5pt" o:hralign="center" o:hrstd="t" o:hr="t"/>
         </w:pict>
       </w:r>
     </w:p>
@@ -592,7 +597,7 @@
     <w:p>
       <w:r>
         <w:pict w14:anchorId="14AADABC">
-          <v:rect id="_x0000_i1061" style="width:0;height:1.5pt" o:hralign="center" o:hrstd="t" o:hr="t"/>
+          <v:rect id="_x0000_i1029" style="width:0;height:1.5pt" o:hralign="center" o:hrstd="t" o:hr="t"/>
         </w:pict>
       </w:r>
     </w:p>
@@ -656,7 +661,7 @@
     <w:p>
       <w:r>
         <w:pict w14:anchorId="79962759">
-          <v:rect id="_x0000_i1062" style="width:0;height:1.5pt" o:hralign="center" o:hrstd="t" o:hr="t"/>
+          <v:rect id="_x0000_i1030" style="width:0;height:1.5pt" o:hralign="center" o:hrstd="t" o:hr="t"/>
         </w:pict>
       </w:r>
       <w:bookmarkStart w:id="7" w:name="bja-magnetics-leominster-ma"/>
@@ -977,7 +982,7 @@
     <w:p>
       <w:r>
         <w:pict w14:anchorId="0F40A075">
-          <v:rect id="_x0000_i1063" style="width:0;height:1.5pt" o:hralign="center" o:hrstd="t" o:hr="t"/>
+          <v:rect id="_x0000_i1031" style="width:0;height:1.5pt" o:hralign="center" o:hrstd="t" o:hr="t"/>
         </w:pict>
       </w:r>
     </w:p>
@@ -1013,7 +1018,7 @@
     <w:p>
       <w:r>
         <w:pict w14:anchorId="18103E9C">
-          <v:rect id="_x0000_i1064" style="width:0;height:1.5pt" o:hralign="center" o:bullet="t" o:hrstd="t" o:hr="t"/>
+          <v:rect id="_x0000_i1032" style="width:0;height:1.5pt" o:hralign="center" o:bullet="t" o:hrstd="t" o:hr="t"/>
         </w:pict>
       </w:r>
     </w:p>
@@ -3889,6 +3894,7 @@
   <w:style w:type="character" w:default="1" w:styleId="DefaultParagraphFont">
     <w:name w:val="Default Paragraph Font"/>
     <w:uiPriority w:val="1"/>
+    <w:semiHidden/>
     <w:unhideWhenUsed/>
   </w:style>
   <w:style w:type="table" w:default="1" w:styleId="TableNormal">

</xml_diff>